<commit_message>
Justificar exclusión del Δ NLR (UCI→D3) de los modelos
Caja explicativa bajo la Tabla 2 con el razonamiento clínico
(tratamiento ya iniciado, ventana corta) y la evidencia
estadística (AUC M2 cae de 0.79 a 0.66 al sustituir; DeLong
p=0.036) que justifican usar la ventana ancha URG → D3.

Co-Authored-By: Claude Opus 4.7 (1M context) <noreply@anthropic.com>
</commit_message>
<xml_diff>
--- a/informe_tutores.docx
+++ b/informe_tutores.docx
@@ -23642,6 +23642,175 @@
         </w:tc>
       </w:tr>
     </w:tbl>
+    <w:p>
+      <w:pPr>
+        <w:pStyle w:val="BodyText"/>
+      </w:pPr>
+      <w:r>
+        <w:rPr>
+          <w:b/>
+          <w:bCs/>
+        </w:rPr>
+        <w:t xml:space="preserve">Por qué el Δ NLR (UCI → D3) no se incluye en los modelos predictivos.</w:t>
+      </w:r>
+      <w:r>
+        <w:t xml:space="preserve"> </w:t>
+      </w:r>
+      <w:r>
+        <w:t xml:space="preserve">Aunque se reporta en la Tabla 2 por completitud, esta variante</w:t>
+      </w:r>
+      <w:r>
+        <w:t xml:space="preserve"> </w:t>
+      </w:r>
+      <w:r>
+        <w:rPr>
+          <w:b/>
+          <w:bCs/>
+        </w:rPr>
+        <w:t xml:space="preserve">no discrimina mortalidad</w:t>
+      </w:r>
+      <w:r>
+        <w:t xml:space="preserve"> </w:t>
+      </w:r>
+      <w:r>
+        <w:t xml:space="preserve">(mediana −1.46 en vivos vs −0.60 en éxitus, p = 0.640) por tres motivos clínica y metodológicamente coherentes:</w:t>
+      </w:r>
+    </w:p>
+    <w:p>
+      <w:pPr>
+        <w:pStyle w:val="Compact"/>
+        <w:numPr>
+          <w:ilvl w:val="0"/>
+          <w:numId w:val="1006"/>
+        </w:numPr>
+      </w:pPr>
+      <w:r>
+        <w:rPr>
+          <w:b/>
+          <w:bCs/>
+        </w:rPr>
+        <w:t xml:space="preserve">Contaminación por el tratamiento.</w:t>
+      </w:r>
+      <w:r>
+        <w:t xml:space="preserve"> </w:t>
+      </w:r>
+      <w:r>
+        <w:t xml:space="preserve">El primer punto de la ventana (analítica de ingreso UCI) ya se obtiene cuando el paciente está recibiendo antibioterapia de amplio espectro, con frecuencia corticoides y soporte hemodinámico/ventilatorio iniciado en urgencias. El cambio en las 72 h posteriores refleja la</w:t>
+      </w:r>
+      <w:r>
+        <w:t xml:space="preserve"> </w:t>
+      </w:r>
+      <w:r>
+        <w:rPr>
+          <w:b/>
+          <w:bCs/>
+        </w:rPr>
+        <w:t xml:space="preserve">respuesta al tratamiento</w:t>
+      </w:r>
+      <w:r>
+        <w:t xml:space="preserve">, no la respuesta inmune basal del huésped, que es lo que aporta valor pronóstico.</w:t>
+      </w:r>
+    </w:p>
+    <w:p>
+      <w:pPr>
+        <w:pStyle w:val="Compact"/>
+        <w:numPr>
+          <w:ilvl w:val="0"/>
+          <w:numId w:val="1006"/>
+        </w:numPr>
+      </w:pPr>
+      <w:r>
+        <w:rPr>
+          <w:b/>
+          <w:bCs/>
+        </w:rPr>
+        <w:t xml:space="preserve">Ventana temporal demasiado corta.</w:t>
+      </w:r>
+      <w:r>
+        <w:t xml:space="preserve"> </w:t>
+      </w:r>
+      <w:r>
+        <w:t xml:space="preserve">Entre URG y UCI median, en la mayoría de pacientes, sólo unas pocas horas, pero es justo cuando ocurre el pico inflamatorio inicial: la NLR sube de forma brusca por demarginación de neutrófilos y linfopenia aguda. Esa parte de la curva queda fuera de la ventana UCI → D3 y dentro de la ventana URG → D3, lo que explica que la primera tenga señal y la segunda no.</w:t>
+      </w:r>
+    </w:p>
+    <w:p>
+      <w:pPr>
+        <w:pStyle w:val="Compact"/>
+        <w:numPr>
+          <w:ilvl w:val="0"/>
+          <w:numId w:val="1006"/>
+        </w:numPr>
+      </w:pPr>
+      <w:r>
+        <w:rPr>
+          <w:b/>
+          <w:bCs/>
+        </w:rPr>
+        <w:t xml:space="preserve">Confirmación por sustitución directa en el multivariante.</w:t>
+      </w:r>
+      <w:r>
+        <w:t xml:space="preserve"> </w:t>
+      </w:r>
+      <w:r>
+        <w:t xml:space="preserve">Sustituir el Δ NLR (URG → D3) por el Δ NLR (UCI → D3) en M2 (SOFA UCI + ΔNLR) baja la</w:t>
+      </w:r>
+      <w:r>
+        <w:t xml:space="preserve"> </w:t>
+      </w:r>
+      <w:r>
+        <w:rPr>
+          <w:b/>
+          <w:bCs/>
+        </w:rPr>
+        <w:t xml:space="preserve">AUC de 0.79 a 0.66</w:t>
+      </w:r>
+      <w:r>
+        <w:t xml:space="preserve"> </w:t>
+      </w:r>
+      <w:r>
+        <w:t xml:space="preserve">(DeLong p = 0.036, caída significativa). En M7 la caída es menor (0.84 → 0.80) porque ΔSOFA y Δ linfocitos compensan, pero el coeficiente del propio Δ NLR (UCI → D3) queda completamente plano (OR = 1.00, p = 0.89): el modelo no le asigna peso. Añadirlo</w:t>
+      </w:r>
+      <w:r>
+        <w:t xml:space="preserve"> </w:t>
+      </w:r>
+      <w:r>
+        <w:rPr>
+          <w:i/>
+          <w:iCs/>
+        </w:rPr>
+        <w:t xml:space="preserve">junto</w:t>
+      </w:r>
+      <w:r>
+        <w:t xml:space="preserve"> </w:t>
+      </w:r>
+      <w:r>
+        <w:t xml:space="preserve">al Δ NLR (URG → D3) tampoco aporta —ambos están moderadamente correlacionados— y deteriora la parsimonia.</w:t>
+      </w:r>
+    </w:p>
+    <w:p>
+      <w:pPr>
+        <w:pStyle w:val="FirstParagraph"/>
+      </w:pPr>
+      <w:r>
+        <w:t xml:space="preserve">Por tanto, el Δ NLR (UCI → D3) figura en la Tabla 2 como</w:t>
+      </w:r>
+      <w:r>
+        <w:t xml:space="preserve"> </w:t>
+      </w:r>
+      <w:r>
+        <w:rPr>
+          <w:b/>
+          <w:bCs/>
+        </w:rPr>
+        <w:t xml:space="preserve">contraste descriptivo</w:t>
+      </w:r>
+      <w:r>
+        <w:t xml:space="preserve"> </w:t>
+      </w:r>
+      <w:r>
+        <w:t xml:space="preserve">que justifica la elección metodológica de la ventana ancha; no entra ni como predictor adicional ni como sustituto en los modelos finales.</w:t>
+      </w:r>
+    </w:p>
     <w:p>
       <w:pPr>
         <w:pStyle w:val="CaptionedFigure"/>
@@ -23943,33 +24112,20 @@
         <w:pStyle w:val="BodyText"/>
       </w:pPr>
       <w:r>
+        <w:t xml:space="preserve">El Δ NLR (UCI → D3) que aparece en la Tabla 2 es un</w:t>
+      </w:r>
+      <w:r>
+        <w:t xml:space="preserve"> </w:t>
+      </w:r>
+      <w:r>
         <w:rPr>
           <w:b/>
           <w:bCs/>
         </w:rPr>
-        <w:t xml:space="preserve">Sobre la ventana corta UCI → D3:</w:t>
-      </w:r>
-      <w:r>
-        <w:t xml:space="preserve"> </w:t>
-      </w:r>
-      <w:r>
-        <w:t xml:space="preserve">la Tabla 2 incluye también el Δ NLR (UCI → D3) como contraste. Esta ventana</w:t>
-      </w:r>
-      <w:r>
-        <w:t xml:space="preserve"> </w:t>
-      </w:r>
-      <w:r>
-        <w:rPr>
-          <w:b/>
-          <w:bCs/>
-        </w:rPr>
-        <w:t xml:space="preserve">no discrimina mortalidad</w:t>
-      </w:r>
-      <w:r>
-        <w:t xml:space="preserve"> </w:t>
-      </w:r>
-      <w:r>
-        <w:t xml:space="preserve">(mediana −1.5 en vivos vs −0.6 en éxitus, p = 0.640). La interpretación clínica es coherente con la fisiopatología: en el momento del ingreso UCI ya se ha iniciado el tratamiento (antibioticoterapia de amplio espectro, corticoides, soporte hemodinámico), de modo que el cambio en las 72 h posteriores refleja sobre todo la respuesta al tratamiento y no la respuesta inmune basal del huésped. La ventana ancha URG → D3, que captura la trayectoria completa desde el primer contacto con el sistema sanitario, es la informativa, y por eso es la que se utiliza en los modelos predictivos.</w:t>
+        <w:t xml:space="preserve">contraste descriptivo, no un predictor</w:t>
+      </w:r>
+      <w:r>
+        <w:t xml:space="preserve">: la justificación detallada de por qué se utiliza la ventana ancha URG → D3 en los modelos está en la caja anterior, pegada a la propia tabla.</w:t>
       </w:r>
     </w:p>
     <w:bookmarkEnd w:id="30"/>
@@ -24091,7 +24247,7 @@
         <w:pStyle w:val="Compact"/>
         <w:numPr>
           <w:ilvl w:val="0"/>
-          <w:numId w:val="1006"/>
+          <w:numId w:val="1007"/>
         </w:numPr>
       </w:pPr>
       <w:r>
@@ -24127,7 +24283,7 @@
         <w:pStyle w:val="Compact"/>
         <w:numPr>
           <w:ilvl w:val="0"/>
-          <w:numId w:val="1006"/>
+          <w:numId w:val="1007"/>
         </w:numPr>
       </w:pPr>
       <w:r>
@@ -25711,7 +25867,7 @@
         <w:pStyle w:val="Compact"/>
         <w:numPr>
           <w:ilvl w:val="0"/>
-          <w:numId w:val="1007"/>
+          <w:numId w:val="1008"/>
         </w:numPr>
       </w:pPr>
       <w:r>
@@ -25726,251 +25882,6 @@
       </w:r>
       <w:r>
         <w:t xml:space="preserve">(AUC 0.656). Esto contrasta con su uso clínico extendido pero es coherente: en una cohorte UCI casi todos los pacientes tienen SOFA elevado (criterio implícito de severidad).</w:t>
-      </w:r>
-    </w:p>
-    <w:p>
-      <w:pPr>
-        <w:pStyle w:val="Compact"/>
-        <w:numPr>
-          <w:ilvl w:val="0"/>
-          <w:numId w:val="1007"/>
-        </w:numPr>
-      </w:pPr>
-      <w:r>
-        <w:rPr>
-          <w:b/>
-          <w:bCs/>
-        </w:rPr>
-        <w:t xml:space="preserve">Añadir el delta de linfocitos absolutos al SOFA inicial mejora la AUC</w:t>
-      </w:r>
-      <w:r>
-        <w:t xml:space="preserve"> </w:t>
-      </w:r>
-      <w:r>
-        <w:t xml:space="preserve">(M3, AUC 0.819 vs 0.656; p DeLong = 0.026).</w:t>
-      </w:r>
-      <w:r>
-        <w:t xml:space="preserve"> </w:t>
-      </w:r>
-      <w:r>
-        <w:rPr>
-          <w:b/>
-          <w:bCs/>
-        </w:rPr>
-        <w:t xml:space="preserve">Sin embargo, tras corrección por las 6 pruebas (BH), la p ajustada sube a 0.078</w:t>
-      </w:r>
-      <w:r>
-        <w:t xml:space="preserve">: la mejora es robusta en magnitud pero no resiste la corrección por comparaciones múltiples con la N disponible.</w:t>
-      </w:r>
-    </w:p>
-    <w:p>
-      <w:pPr>
-        <w:pStyle w:val="Compact"/>
-        <w:numPr>
-          <w:ilvl w:val="0"/>
-          <w:numId w:val="1007"/>
-        </w:numPr>
-      </w:pPr>
-      <w:r>
-        <w:rPr>
-          <w:b/>
-          <w:bCs/>
-        </w:rPr>
-        <w:t xml:space="preserve">Sustituir el SOFA inicial por el ΔSOFA NO aporta más información</w:t>
-      </w:r>
-      <w:r>
-        <w:t xml:space="preserve"> </w:t>
-      </w:r>
-      <w:r>
-        <w:t xml:space="preserve">(M4 vs M1: prácticamente la misma AUC). En esta cohorte el</w:t>
-      </w:r>
-      <w:r>
-        <w:t xml:space="preserve"> </w:t>
-      </w:r>
-      <w:r>
-        <w:t xml:space="preserve">“cambio del SOFA”</w:t>
-      </w:r>
-      <w:r>
-        <w:t xml:space="preserve"> </w:t>
-      </w:r>
-      <w:r>
-        <w:t xml:space="preserve">y</w:t>
-      </w:r>
-      <w:r>
-        <w:t xml:space="preserve"> </w:t>
-      </w:r>
-      <w:r>
-        <w:t xml:space="preserve">“el SOFA al ingreso”</w:t>
-      </w:r>
-      <w:r>
-        <w:t xml:space="preserve"> </w:t>
-      </w:r>
-      <w:r>
-        <w:t xml:space="preserve">miden cosas equivalentes.</w:t>
-      </w:r>
-    </w:p>
-    <w:p>
-      <w:pPr>
-        <w:pStyle w:val="Compact"/>
-        <w:numPr>
-          <w:ilvl w:val="0"/>
-          <w:numId w:val="1007"/>
-        </w:numPr>
-      </w:pPr>
-      <w:r>
-        <w:rPr>
-          <w:b/>
-          <w:bCs/>
-        </w:rPr>
-        <w:t xml:space="preserve">El modelo más complejo (M7) es el de mayor AUC (0.840)</w:t>
-      </w:r>
-      <w:r>
-        <w:t xml:space="preserve">, aunque la mejora sobre M1 no llega a significación (p=0.099, p_BH=0.198) por la pérdida de potencia con N=10 eventos.</w:t>
-      </w:r>
-    </w:p>
-    <w:p>
-      <w:pPr>
-        <w:pStyle w:val="FirstParagraph"/>
-      </w:pPr>
-      <w:r>
-        <w:rPr>
-          <w:b/>
-          <w:bCs/>
-        </w:rPr>
-        <w:t xml:space="preserve">Por qué reportar las dos columnas (p y p_BH):</w:t>
-      </w:r>
-      <w:r>
-        <w:t xml:space="preserve"> </w:t>
-      </w:r>
-      <w:r>
-        <w:t xml:space="preserve">la p sin corregir indica si una sola comparación pareada es estadísticamente distinguible del azar. La p_BH controla el riesgo de descubrimiento falso cuando se hacen muchas comparaciones a la vez. Los modelos más interesantes (M2, M3) sobreviven a la corrección como</w:t>
-      </w:r>
-      <w:r>
-        <w:t xml:space="preserve"> </w:t>
-      </w:r>
-      <w:r>
-        <w:t xml:space="preserve">“sugerentes”</w:t>
-      </w:r>
-      <w:r>
-        <w:t xml:space="preserve"> </w:t>
-      </w:r>
-      <w:r>
-        <w:t xml:space="preserve">pero no como</w:t>
-      </w:r>
-      <w:r>
-        <w:t xml:space="preserve"> </w:t>
-      </w:r>
-      <w:r>
-        <w:t xml:space="preserve">“concluyentes”</w:t>
-      </w:r>
-      <w:r>
-        <w:t xml:space="preserve">. La interpretación principal del estudio se apoya por tanto en el</w:t>
-      </w:r>
-      <w:r>
-        <w:t xml:space="preserve"> </w:t>
-      </w:r>
-      <w:r>
-        <w:rPr>
-          <w:b/>
-          <w:bCs/>
-        </w:rPr>
-        <w:t xml:space="preserve">bootstrap de la siguiente sección</w:t>
-      </w:r>
-      <w:r>
-        <w:t xml:space="preserve"> </w:t>
-      </w:r>
-      <w:r>
-        <w:t xml:space="preserve">(que cuantifica el rendimiento real del modelo, no su superioridad sobre M1).</w:t>
-      </w:r>
-    </w:p>
-    <w:bookmarkEnd w:id="34"/>
-    <w:bookmarkStart w:id="38" w:name="validacion"/>
-    <w:p>
-      <w:pPr>
-        <w:pStyle w:val="Heading2"/>
-      </w:pPr>
-      <w:r>
-        <w:t xml:space="preserve">4.4 Modelo principal y validación interna</w:t>
-      </w:r>
-    </w:p>
-    <w:p>
-      <w:pPr>
-        <w:pStyle w:val="FirstParagraph"/>
-      </w:pPr>
-      <w:r>
-        <w:rPr>
-          <w:b/>
-          <w:bCs/>
-        </w:rPr>
-        <w:t xml:space="preserve">Lo que se muestra:</w:t>
-      </w:r>
-      <w:r>
-        <w:t xml:space="preserve"> </w:t>
-      </w:r>
-      <w:r>
-        <w:t xml:space="preserve">las</w:t>
-      </w:r>
-      <w:r>
-        <w:t xml:space="preserve"> </w:t>
-      </w:r>
-      <w:r>
-        <w:rPr>
-          <w:b/>
-          <w:bCs/>
-        </w:rPr>
-        <w:t xml:space="preserve">Tablas 4a y 4b</w:t>
-      </w:r>
-      <w:r>
-        <w:t xml:space="preserve"> </w:t>
-      </w:r>
-      <w:r>
-        <w:t xml:space="preserve">y la</w:t>
-      </w:r>
-      <w:r>
-        <w:t xml:space="preserve"> </w:t>
-      </w:r>
-      <w:r>
-        <w:rPr>
-          <w:b/>
-          <w:bCs/>
-        </w:rPr>
-        <w:t xml:space="preserve">Figura 5</w:t>
-      </w:r>
-      <w:r>
-        <w:t xml:space="preserve"> </w:t>
-      </w:r>
-      <w:r>
-        <w:t xml:space="preserve">validan los dos modelos finalistas (M3 y M7) por bootstrap de Harrell con 1000 réplicas, y reportan dos puntos de corte distintos para cada uno: Youden (regla habitual, equilibra Sens y Esp) y Sp ≥ 0.90 (regla de</w:t>
-      </w:r>
-      <w:r>
-        <w:t xml:space="preserve"> </w:t>
-      </w:r>
-      <w:r>
-        <w:t xml:space="preserve">“alta especificidad”</w:t>
-      </w:r>
-      <w:r>
-        <w:t xml:space="preserve">, para escenarios donde el coste del falso positivo es alto).</w:t>
-      </w:r>
-    </w:p>
-    <w:p>
-      <w:pPr>
-        <w:pStyle w:val="BodyText"/>
-      </w:pPr>
-      <w:r>
-        <w:t xml:space="preserve">Tras la comparación de los siete modelos se proponen</w:t>
-      </w:r>
-      <w:r>
-        <w:t xml:space="preserve"> </w:t>
-      </w:r>
-      <w:r>
-        <w:rPr>
-          <w:b/>
-          <w:bCs/>
-        </w:rPr>
-        <w:t xml:space="preserve">dos modelos para la práctica clínica</w:t>
-      </w:r>
-      <w:r>
-        <w:t xml:space="preserve">, con propósitos diferentes:</w:t>
       </w:r>
     </w:p>
     <w:p>
@@ -25986,13 +25897,26 @@
           <w:b/>
           <w:bCs/>
         </w:rPr>
-        <w:t xml:space="preserve">Modelo M3</w:t>
+        <w:t xml:space="preserve">Añadir el delta de linfocitos absolutos al SOFA inicial mejora la AUC</w:t>
       </w:r>
       <w:r>
         <w:t xml:space="preserve"> </w:t>
       </w:r>
       <w:r>
-        <w:t xml:space="preserve">(parsimonioso, defendible como modelo principal): SOFA UCI + Δlinfocitos URG-D3.</w:t>
+        <w:t xml:space="preserve">(M3, AUC 0.819 vs 0.656; p DeLong = 0.026).</w:t>
+      </w:r>
+      <w:r>
+        <w:t xml:space="preserve"> </w:t>
+      </w:r>
+      <w:r>
+        <w:rPr>
+          <w:b/>
+          <w:bCs/>
+        </w:rPr>
+        <w:t xml:space="preserve">Sin embargo, tras corrección por las 6 pruebas (BH), la p ajustada sube a 0.078</w:t>
+      </w:r>
+      <w:r>
+        <w:t xml:space="preserve">: la mejora es robusta en magnitud pero no resiste la corrección por comparaciones múltiples con la N disponible.</w:t>
       </w:r>
     </w:p>
     <w:p>
@@ -26001,6 +25925,238 @@
         <w:numPr>
           <w:ilvl w:val="0"/>
           <w:numId w:val="1008"/>
+        </w:numPr>
+      </w:pPr>
+      <w:r>
+        <w:rPr>
+          <w:b/>
+          <w:bCs/>
+        </w:rPr>
+        <w:t xml:space="preserve">Sustituir el SOFA inicial por el ΔSOFA NO aporta más información</w:t>
+      </w:r>
+      <w:r>
+        <w:t xml:space="preserve"> </w:t>
+      </w:r>
+      <w:r>
+        <w:t xml:space="preserve">(M4 vs M1: prácticamente la misma AUC). En esta cohorte el</w:t>
+      </w:r>
+      <w:r>
+        <w:t xml:space="preserve"> </w:t>
+      </w:r>
+      <w:r>
+        <w:t xml:space="preserve">“cambio del SOFA”</w:t>
+      </w:r>
+      <w:r>
+        <w:t xml:space="preserve"> </w:t>
+      </w:r>
+      <w:r>
+        <w:t xml:space="preserve">y</w:t>
+      </w:r>
+      <w:r>
+        <w:t xml:space="preserve"> </w:t>
+      </w:r>
+      <w:r>
+        <w:t xml:space="preserve">“el SOFA al ingreso”</w:t>
+      </w:r>
+      <w:r>
+        <w:t xml:space="preserve"> </w:t>
+      </w:r>
+      <w:r>
+        <w:t xml:space="preserve">miden cosas equivalentes.</w:t>
+      </w:r>
+    </w:p>
+    <w:p>
+      <w:pPr>
+        <w:pStyle w:val="Compact"/>
+        <w:numPr>
+          <w:ilvl w:val="0"/>
+          <w:numId w:val="1008"/>
+        </w:numPr>
+      </w:pPr>
+      <w:r>
+        <w:rPr>
+          <w:b/>
+          <w:bCs/>
+        </w:rPr>
+        <w:t xml:space="preserve">El modelo más complejo (M7) es el de mayor AUC (0.840)</w:t>
+      </w:r>
+      <w:r>
+        <w:t xml:space="preserve">, aunque la mejora sobre M1 no llega a significación (p=0.099, p_BH=0.198) por la pérdida de potencia con N=10 eventos.</w:t>
+      </w:r>
+    </w:p>
+    <w:p>
+      <w:pPr>
+        <w:pStyle w:val="FirstParagraph"/>
+      </w:pPr>
+      <w:r>
+        <w:rPr>
+          <w:b/>
+          <w:bCs/>
+        </w:rPr>
+        <w:t xml:space="preserve">Por qué reportar las dos columnas (p y p_BH):</w:t>
+      </w:r>
+      <w:r>
+        <w:t xml:space="preserve"> </w:t>
+      </w:r>
+      <w:r>
+        <w:t xml:space="preserve">la p sin corregir indica si una sola comparación pareada es estadísticamente distinguible del azar. La p_BH controla el riesgo de descubrimiento falso cuando se hacen muchas comparaciones a la vez. Los modelos más interesantes (M2, M3) sobreviven a la corrección como</w:t>
+      </w:r>
+      <w:r>
+        <w:t xml:space="preserve"> </w:t>
+      </w:r>
+      <w:r>
+        <w:t xml:space="preserve">“sugerentes”</w:t>
+      </w:r>
+      <w:r>
+        <w:t xml:space="preserve"> </w:t>
+      </w:r>
+      <w:r>
+        <w:t xml:space="preserve">pero no como</w:t>
+      </w:r>
+      <w:r>
+        <w:t xml:space="preserve"> </w:t>
+      </w:r>
+      <w:r>
+        <w:t xml:space="preserve">“concluyentes”</w:t>
+      </w:r>
+      <w:r>
+        <w:t xml:space="preserve">. La interpretación principal del estudio se apoya por tanto en el</w:t>
+      </w:r>
+      <w:r>
+        <w:t xml:space="preserve"> </w:t>
+      </w:r>
+      <w:r>
+        <w:rPr>
+          <w:b/>
+          <w:bCs/>
+        </w:rPr>
+        <w:t xml:space="preserve">bootstrap de la siguiente sección</w:t>
+      </w:r>
+      <w:r>
+        <w:t xml:space="preserve"> </w:t>
+      </w:r>
+      <w:r>
+        <w:t xml:space="preserve">(que cuantifica el rendimiento real del modelo, no su superioridad sobre M1).</w:t>
+      </w:r>
+    </w:p>
+    <w:bookmarkEnd w:id="34"/>
+    <w:bookmarkStart w:id="38" w:name="validacion"/>
+    <w:p>
+      <w:pPr>
+        <w:pStyle w:val="Heading2"/>
+      </w:pPr>
+      <w:r>
+        <w:t xml:space="preserve">4.4 Modelo principal y validación interna</w:t>
+      </w:r>
+    </w:p>
+    <w:p>
+      <w:pPr>
+        <w:pStyle w:val="FirstParagraph"/>
+      </w:pPr>
+      <w:r>
+        <w:rPr>
+          <w:b/>
+          <w:bCs/>
+        </w:rPr>
+        <w:t xml:space="preserve">Lo que se muestra:</w:t>
+      </w:r>
+      <w:r>
+        <w:t xml:space="preserve"> </w:t>
+      </w:r>
+      <w:r>
+        <w:t xml:space="preserve">las</w:t>
+      </w:r>
+      <w:r>
+        <w:t xml:space="preserve"> </w:t>
+      </w:r>
+      <w:r>
+        <w:rPr>
+          <w:b/>
+          <w:bCs/>
+        </w:rPr>
+        <w:t xml:space="preserve">Tablas 4a y 4b</w:t>
+      </w:r>
+      <w:r>
+        <w:t xml:space="preserve"> </w:t>
+      </w:r>
+      <w:r>
+        <w:t xml:space="preserve">y la</w:t>
+      </w:r>
+      <w:r>
+        <w:t xml:space="preserve"> </w:t>
+      </w:r>
+      <w:r>
+        <w:rPr>
+          <w:b/>
+          <w:bCs/>
+        </w:rPr>
+        <w:t xml:space="preserve">Figura 5</w:t>
+      </w:r>
+      <w:r>
+        <w:t xml:space="preserve"> </w:t>
+      </w:r>
+      <w:r>
+        <w:t xml:space="preserve">validan los dos modelos finalistas (M3 y M7) por bootstrap de Harrell con 1000 réplicas, y reportan dos puntos de corte distintos para cada uno: Youden (regla habitual, equilibra Sens y Esp) y Sp ≥ 0.90 (regla de</w:t>
+      </w:r>
+      <w:r>
+        <w:t xml:space="preserve"> </w:t>
+      </w:r>
+      <w:r>
+        <w:t xml:space="preserve">“alta especificidad”</w:t>
+      </w:r>
+      <w:r>
+        <w:t xml:space="preserve">, para escenarios donde el coste del falso positivo es alto).</w:t>
+      </w:r>
+    </w:p>
+    <w:p>
+      <w:pPr>
+        <w:pStyle w:val="BodyText"/>
+      </w:pPr>
+      <w:r>
+        <w:t xml:space="preserve">Tras la comparación de los siete modelos se proponen</w:t>
+      </w:r>
+      <w:r>
+        <w:t xml:space="preserve"> </w:t>
+      </w:r>
+      <w:r>
+        <w:rPr>
+          <w:b/>
+          <w:bCs/>
+        </w:rPr>
+        <w:t xml:space="preserve">dos modelos para la práctica clínica</w:t>
+      </w:r>
+      <w:r>
+        <w:t xml:space="preserve">, con propósitos diferentes:</w:t>
+      </w:r>
+    </w:p>
+    <w:p>
+      <w:pPr>
+        <w:pStyle w:val="Compact"/>
+        <w:numPr>
+          <w:ilvl w:val="0"/>
+          <w:numId w:val="1009"/>
+        </w:numPr>
+      </w:pPr>
+      <w:r>
+        <w:rPr>
+          <w:b/>
+          <w:bCs/>
+        </w:rPr>
+        <w:t xml:space="preserve">Modelo M3</w:t>
+      </w:r>
+      <w:r>
+        <w:t xml:space="preserve"> </w:t>
+      </w:r>
+      <w:r>
+        <w:t xml:space="preserve">(parsimonioso, defendible como modelo principal): SOFA UCI + Δlinfocitos URG-D3.</w:t>
+      </w:r>
+    </w:p>
+    <w:p>
+      <w:pPr>
+        <w:pStyle w:val="Compact"/>
+        <w:numPr>
+          <w:ilvl w:val="0"/>
+          <w:numId w:val="1009"/>
         </w:numPr>
       </w:pPr>
       <w:r>
@@ -27532,7 +27688,7 @@
         <w:pStyle w:val="Compact"/>
         <w:numPr>
           <w:ilvl w:val="0"/>
-          <w:numId w:val="1009"/>
+          <w:numId w:val="1010"/>
         </w:numPr>
       </w:pPr>
       <w:r>
@@ -27596,7 +27752,7 @@
         <w:pStyle w:val="Compact"/>
         <w:numPr>
           <w:ilvl w:val="0"/>
-          <w:numId w:val="1009"/>
+          <w:numId w:val="1010"/>
         </w:numPr>
       </w:pPr>
       <w:r>
@@ -27674,7 +27830,7 @@
         <w:pStyle w:val="Compact"/>
         <w:numPr>
           <w:ilvl w:val="0"/>
-          <w:numId w:val="1009"/>
+          <w:numId w:val="1010"/>
         </w:numPr>
       </w:pPr>
       <w:r>
@@ -29913,7 +30069,7 @@
         <w:pStyle w:val="Compact"/>
         <w:numPr>
           <w:ilvl w:val="0"/>
-          <w:numId w:val="1010"/>
+          <w:numId w:val="1011"/>
         </w:numPr>
       </w:pPr>
       <w:r>
@@ -29962,7 +30118,7 @@
         <w:pStyle w:val="Compact"/>
         <w:numPr>
           <w:ilvl w:val="0"/>
-          <w:numId w:val="1010"/>
+          <w:numId w:val="1011"/>
         </w:numPr>
       </w:pPr>
       <w:r>
@@ -30011,7 +30167,7 @@
         <w:pStyle w:val="Compact"/>
         <w:numPr>
           <w:ilvl w:val="0"/>
-          <w:numId w:val="1010"/>
+          <w:numId w:val="1011"/>
         </w:numPr>
       </w:pPr>
       <w:r>
@@ -30700,7 +30856,7 @@
         <w:pStyle w:val="Compact"/>
         <w:numPr>
           <w:ilvl w:val="0"/>
-          <w:numId w:val="1011"/>
+          <w:numId w:val="1012"/>
         </w:numPr>
       </w:pPr>
       <w:r>
@@ -30738,7 +30894,7 @@
         <w:pStyle w:val="Compact"/>
         <w:numPr>
           <w:ilvl w:val="0"/>
-          <w:numId w:val="1011"/>
+          <w:numId w:val="1012"/>
         </w:numPr>
       </w:pPr>
       <w:r>
@@ -31209,7 +31365,7 @@
       <w:pPr>
         <w:numPr>
           <w:ilvl w:val="0"/>
-          <w:numId w:val="1012"/>
+          <w:numId w:val="1013"/>
         </w:numPr>
       </w:pPr>
       <w:r>
@@ -31230,7 +31386,7 @@
       <w:pPr>
         <w:numPr>
           <w:ilvl w:val="0"/>
-          <w:numId w:val="1012"/>
+          <w:numId w:val="1013"/>
         </w:numPr>
       </w:pPr>
       <w:r>
@@ -31251,7 +31407,7 @@
       <w:pPr>
         <w:numPr>
           <w:ilvl w:val="0"/>
-          <w:numId w:val="1012"/>
+          <w:numId w:val="1013"/>
         </w:numPr>
       </w:pPr>
       <w:r>
@@ -31269,7 +31425,7 @@
       <w:pPr>
         <w:numPr>
           <w:ilvl w:val="0"/>
-          <w:numId w:val="1012"/>
+          <w:numId w:val="1013"/>
         </w:numPr>
       </w:pPr>
       <w:r>
@@ -31290,7 +31446,7 @@
       <w:pPr>
         <w:numPr>
           <w:ilvl w:val="0"/>
-          <w:numId w:val="1012"/>
+          <w:numId w:val="1013"/>
         </w:numPr>
       </w:pPr>
       <w:r>
@@ -32850,9 +33006,6 @@
     <w:abstractNumId w:val="991"/>
   </w:num>
   <w:num w:numId="1006">
-    <w:abstractNumId w:val="991"/>
-  </w:num>
-  <w:num w:numId="1007">
     <w:abstractNumId w:val="99411"/>
     <w:lvlOverride w:ilvl="0">
       <w:startOverride w:val="1"/>
@@ -32882,8 +33035,38 @@
       <w:startOverride w:val="1"/>
     </w:lvlOverride>
   </w:num>
+  <w:num w:numId="1007">
+    <w:abstractNumId w:val="991"/>
+  </w:num>
   <w:num w:numId="1008">
-    <w:abstractNumId w:val="991"/>
+    <w:abstractNumId w:val="99411"/>
+    <w:lvlOverride w:ilvl="0">
+      <w:startOverride w:val="1"/>
+    </w:lvlOverride>
+    <w:lvlOverride w:ilvl="1">
+      <w:startOverride w:val="1"/>
+    </w:lvlOverride>
+    <w:lvlOverride w:ilvl="2">
+      <w:startOverride w:val="1"/>
+    </w:lvlOverride>
+    <w:lvlOverride w:ilvl="3">
+      <w:startOverride w:val="1"/>
+    </w:lvlOverride>
+    <w:lvlOverride w:ilvl="4">
+      <w:startOverride w:val="1"/>
+    </w:lvlOverride>
+    <w:lvlOverride w:ilvl="5">
+      <w:startOverride w:val="1"/>
+    </w:lvlOverride>
+    <w:lvlOverride w:ilvl="6">
+      <w:startOverride w:val="1"/>
+    </w:lvlOverride>
+    <w:lvlOverride w:ilvl="7">
+      <w:startOverride w:val="1"/>
+    </w:lvlOverride>
+    <w:lvlOverride w:ilvl="8">
+      <w:startOverride w:val="1"/>
+    </w:lvlOverride>
   </w:num>
   <w:num w:numId="1009">
     <w:abstractNumId w:val="991"/>
@@ -32895,6 +33078,9 @@
     <w:abstractNumId w:val="991"/>
   </w:num>
   <w:num w:numId="1012">
+    <w:abstractNumId w:val="991"/>
+  </w:num>
+  <w:num w:numId="1013">
     <w:abstractNumId w:val="99411"/>
     <w:lvlOverride w:ilvl="0">
       <w:startOverride w:val="1"/>

</xml_diff>